<commit_message>
docs(week6): corrected Asset Engineering submission (tag week-6-redo-fix)
</commit_message>
<xml_diff>
--- a/submissions/week6/Group9_Curriculum_Intelligence_Engine_Week6_Asset_Engineering.docx
+++ b/submissions/week6/Group9_Curriculum_Intelligence_Engine_Week6_Asset_Engineering.docx
@@ -38,9 +38,9 @@
         </w:rPr>
         <w:t>Repository : https://github.com/jainamsethia/Curriculum-Intelligence-Engine</w:t>
         <w:br/>
-        <w:t>Tag        : week-6-redo</w:t>
+        <w:t>Tag        : week-6-redo-fix</w:t>
         <w:br/>
-        <w:t>Commit     : df06049114b2d407eff248c6f6d6c8d39ebbf63a</w:t>
+        <w:t>Commit     : ee7c1cdf31ee65b973018afccbf33f69968e173f</w:t>
         <w:br/>
         <w:t>Install    : pip install -e .[dev]</w:t>
         <w:br/>
@@ -438,7 +438,7 @@
                 <w:b w:val="0"/>
                 <w:sz w:val="16"/>
               </w:rPr>
-              <w:t xml:space="preserve"> version 0.6.0, FastAPI service with 8 endpoints, Pydantic schemas, OpenAPI</w:t>
+              <w:t xml:space="preserve"> version 0.6.0, FastAPI service with 7 endpoints, Pydantic schemas, OpenAPI</w:t>
             </w:r>
           </w:p>
         </w:tc>
@@ -1006,7 +1006,7 @@
         <w:rPr>
           <w:b w:val="0"/>
         </w:rPr>
-        <w:t>Caution: the rules were designed from test-split failure cases, so the after-numbers on test labels are optimistic. The fresh validation sample is less biased; its intervals overlap, so the gain is indicative, not proven. A first attempt that pooled words across all earlier course names (removal recall 0.627) was replaced; its results stay in the results file. The fresh items were labelled with the Week 3 flag protocol (two Claude passes plus a pass 3, LLM-vs-LLM agreement not independent).</w:t>
+        <w:t>Caution: the rules were designed from test-split failure cases, so the after-numbers on test labels are optimistic. The fresh validation sample is less biased; its intervals overlap, so the gain is indicative, not proven. A first attempt that pooled words across all earlier course names (removal recall 0.627) was replaced; its results stay in the results file. The 45 fresh items were labelled with the Week 3 flag protocol: two Claude passes with different wording agreed on 45 of them, so pass 3 was needed for 0 items (same model family: this agreement is not independent).</w:t>
       </w:r>
     </w:p>
     <w:p>

</xml_diff>